<commit_message>
Updated BP for EcoGrid
</commit_message>
<xml_diff>
--- a/SmartGrid/Commercial/BP/ECOGRID_Business_Plan_EN.docx
+++ b/SmartGrid/Commercial/BP/ECOGRID_Business_Plan_EN.docx
@@ -340,7 +340,7 @@
                 <w:sz w:val="20"/>
                 <w:szCs w:val="20"/>
               </w:rPr>
-              <w:t xml:space="preserve">Marine de Caprone (Corsica) — CAPEX €5.7M, savings ≈ €860k/yr</w:t>
+              <w:t>Marine de Caprone (Corsica) — CAPEX €5.7M, savings ≈ €480k/yr</w:t>
             </w:r>
           </w:p>
         </w:tc>
@@ -572,7 +572,7 @@
                 <w:sz w:val="20"/>
                 <w:szCs w:val="20"/>
               </w:rPr>
-              <w:t xml:space="preserve">≈ 9.5-yr payback (CAPEX net of aids) · ≈ 3.2× over the 30-yr lease</w:t>
+              <w:t>≈ 17-yr payback (CAPEX net of aids) · ≈ 1.75× over the 30-yr lease</w:t>
             </w:r>
           </w:p>
         </w:tc>
@@ -4370,7 +4370,7 @@
                 <w:sz w:val="20"/>
                 <w:szCs w:val="20"/>
               </w:rPr>
-              <w:t xml:space="preserve">€190k → €350k</w:t>
+              <w:t>€190k → €200k</w:t>
             </w:r>
           </w:p>
         </w:tc>
@@ -4396,7 +4396,7 @@
                 <w:sz w:val="20"/>
                 <w:szCs w:val="20"/>
               </w:rPr>
-              <w:t xml:space="preserve">7–11 yrs</w:t>
+              <w:t>10–14 yrs</w:t>
             </w:r>
           </w:p>
         </w:tc>
@@ -4502,7 +4502,7 @@
                 <w:sz w:val="20"/>
                 <w:szCs w:val="20"/>
               </w:rPr>
-              <w:t xml:space="preserve">€440k → €860k</w:t>
+              <w:t>€440k → €500k</w:t>
             </w:r>
           </w:p>
         </w:tc>
@@ -4528,7 +4528,7 @@
                 <w:sz w:val="20"/>
                 <w:szCs w:val="20"/>
               </w:rPr>
-              <w:t xml:space="preserve">6.6–12 yrs</w:t>
+              <w:t>10–14 yrs</w:t>
             </w:r>
           </w:p>
         </w:tc>
@@ -4973,7 +4973,7 @@
                 <w:sz w:val="20"/>
                 <w:szCs w:val="20"/>
               </w:rPr>
-              <w:t xml:space="preserve">≈ 6–7 yrs on savings (≈ €860k/yr)</w:t>
+              <w:t>≈ 10–11 yrs on savings (≈ €480k/yr)</w:t>
             </w:r>
           </w:p>
         </w:tc>
@@ -5248,7 +5248,7 @@
                 <w:sz w:val="20"/>
                 <w:szCs w:val="20"/>
               </w:rPr>
-              <w:t xml:space="preserve">≈ €511k (savings share + SaaS − maintenance)</w:t>
+              <w:t>≈ €283k (savings share + SaaS − maintenance)</w:t>
             </w:r>
           </w:p>
         </w:tc>
@@ -5306,7 +5306,7 @@
                 <w:sz w:val="20"/>
                 <w:szCs w:val="20"/>
               </w:rPr>
-              <w:t xml:space="preserve">≈ 9.5 yrs on net CAPEX</w:t>
+              <w:t>≈ 17 yrs on net CAPEX</w:t>
             </w:r>
           </w:p>
         </w:tc>
@@ -5422,7 +5422,7 @@
                 <w:sz w:val="20"/>
                 <w:szCs w:val="20"/>
               </w:rPr>
-              <w:t xml:space="preserve">≈ 3.2× net CAPEX</w:t>
+              <w:t>≈ 1.75× net CAPEX</w:t>
             </w:r>
           </w:p>
         </w:tc>
@@ -5717,7 +5717,7 @@
                 <w:sz w:val="20"/>
                 <w:szCs w:val="20"/>
               </w:rPr>
-              <w:t xml:space="preserve">≈ €860k</w:t>
+              <w:t>≈ €480k</w:t>
             </w:r>
           </w:p>
         </w:tc>

</xml_diff>

<commit_message>
Add bilingual deck + Azure deploy
</commit_message>
<xml_diff>
--- a/SmartGrid/Commercial/BP/ECOGRID_Business_Plan_EN.docx
+++ b/SmartGrid/Commercial/BP/ECOGRID_Business_Plan_EN.docx
@@ -5883,7 +5883,7 @@
         <w:spacing w:after="120"/>
       </w:pPr>
       <w:r>
-        <w:t xml:space="preserve">Five founding shareholders (paid €5k/month from day 1) and a lean team:</w:t>
+        <w:t xml:space="preserve">Five founding shareholders (paid €3k/month from day 1) and a lean team:</w:t>
       </w:r>
     </w:p>
     <w:tbl>
@@ -6812,7 +6812,7 @@
         <w:pStyle w:val="Heading2"/>
       </w:pPr>
       <w:r>
-        <w:t xml:space="preserve">Operating costs — year 1: ≈ €872k</w:t>
+        <w:t xml:space="preserve">Operating costs — year 1: ≈ €502k recurring (+ €250k software CAPEX Year 0)</w:t>
       </w:r>
     </w:p>
     <w:tbl>
@@ -6916,7 +6916,7 @@
                 <w:sz w:val="20"/>
                 <w:szCs w:val="20"/>
               </w:rPr>
-              <w:t xml:space="preserve">Shareholder compensation (5 × €5k/mo)</w:t>
+              <w:t xml:space="preserve">Shareholder compensation (5 × €3k/mo)</w:t>
             </w:r>
           </w:p>
         </w:tc>
@@ -6944,7 +6944,7 @@
                 <w:sz w:val="20"/>
                 <w:szCs w:val="20"/>
               </w:rPr>
-              <w:t xml:space="preserve">€300k</w:t>
+              <w:t xml:space="preserve">€180k</w:t>
             </w:r>
           </w:p>
         </w:tc>
@@ -7060,7 +7060,7 @@
                 <w:sz w:val="20"/>
                 <w:szCs w:val="20"/>
               </w:rPr>
-              <w:t xml:space="preserve">€250k (year 1)</w:t>
+              <w:t xml:space="preserve">€250k (CAPEX Year 0 — not in OPEX)</w:t>
             </w:r>
           </w:p>
         </w:tc>
@@ -7559,7 +7559,7 @@
                 <w:sz w:val="20"/>
                 <w:szCs w:val="20"/>
               </w:rPr>
-              <w:t xml:space="preserve">(€872k)</w:t>
+              <w:t xml:space="preserve">(€502k)</w:t>
             </w:r>
           </w:p>
         </w:tc>
@@ -8179,7 +8179,7 @@
         <w:spacing w:after="120"/>
       </w:pPr>
       <w:r>
-        <w:t xml:space="preserve">The operating company needs about €1.3M to cover the first two years (€872k + €420k) until EBITDA turns positive in 2028. Model 2 plants are funded separately in SPVs (investor equity + green debt + aids), with a cumulative gross asset volume of about €218M by 2035 in the central scenario.</w:t>
+        <w:t xml:space="preserve">The operating company needs about €920k to cover the first two years (€502k recurring OPEX Year 1 + €420k Year 2) until EBITDA turns positive in 2028, plus €250k software development CAPEX (Year 0). Model 2 plants are funded separately in SPVs (investor equity + green debt + aids), with a cumulative gross asset volume of about €218M by 2035 in the central scenario.</w:t>
       </w:r>
     </w:p>
     <w:p>

</xml_diff>